<commit_message>
added a few more comments
</commit_message>
<xml_diff>
--- a/Screenshots.docx
+++ b/Screenshots.docx
@@ -54,25 +54,52 @@
         <w:t>Screenshots</w:t>
       </w:r>
     </w:p>
-    <w:p/>
+    <w:p>
+      <w:pPr>
+        <w:rPr>
+          <w:rFonts w:asciiTheme="majorBidi" w:hAnsiTheme="majorBidi" w:cstheme="majorBidi"/>
+        </w:rPr>
+      </w:pPr>
+    </w:p>
     <w:p>
       <w:pPr>
         <w:pStyle w:val="Subtitle"/>
-      </w:pPr>
-      <w:r>
+        <w:rPr>
+          <w:rFonts w:asciiTheme="majorBidi" w:hAnsiTheme="majorBidi"/>
+        </w:rPr>
+      </w:pPr>
+      <w:r>
+        <w:rPr>
+          <w:rFonts w:asciiTheme="majorBidi" w:hAnsiTheme="majorBidi"/>
+        </w:rPr>
         <w:t>Tables Creation</w:t>
       </w:r>
     </w:p>
     <w:p>
-      <w:r>
+      <w:pPr>
+        <w:rPr>
+          <w:rFonts w:asciiTheme="majorBidi" w:hAnsiTheme="majorBidi" w:cstheme="majorBidi"/>
+        </w:rPr>
+      </w:pPr>
+      <w:r>
+        <w:rPr>
+          <w:rFonts w:asciiTheme="majorBidi" w:hAnsiTheme="majorBidi" w:cstheme="majorBidi"/>
+        </w:rPr>
         <w:t>INVESTOR Table</w:t>
       </w:r>
     </w:p>
     <w:p>
       <w:pPr>
         <w:jc w:val="center"/>
-      </w:pPr>
-      <w:r>
+        <w:rPr>
+          <w:rFonts w:asciiTheme="majorBidi" w:hAnsiTheme="majorBidi" w:cstheme="majorBidi"/>
+        </w:rPr>
+      </w:pPr>
+      <w:r>
+        <w:rPr>
+          <w:rFonts w:asciiTheme="majorBidi" w:hAnsiTheme="majorBidi" w:cstheme="majorBidi"/>
+          <w:noProof/>
+        </w:rPr>
         <w:drawing>
           <wp:inline distT="0" distB="0" distL="0" distR="0" wp14:anchorId="1B4A5389" wp14:editId="5E2BA253">
             <wp:extent cx="3570692" cy="1671637"/>
@@ -89,7 +116,7 @@
                     <pic:cNvPicPr/>
                   </pic:nvPicPr>
                   <pic:blipFill>
-                    <a:blip r:embed="rId4"/>
+                    <a:blip r:embed="rId6"/>
                     <a:stretch>
                       <a:fillRect/>
                     </a:stretch>
@@ -133,6 +160,7 @@
       <w:r>
         <w:rPr>
           <w:rFonts w:asciiTheme="majorBidi" w:hAnsiTheme="majorBidi" w:cstheme="majorBidi"/>
+          <w:noProof/>
         </w:rPr>
         <w:drawing>
           <wp:inline distT="0" distB="0" distL="0" distR="0" wp14:anchorId="4B36E685" wp14:editId="0FC5C968">
@@ -150,7 +178,7 @@
                     <pic:cNvPicPr/>
                   </pic:nvPicPr>
                   <pic:blipFill>
-                    <a:blip r:embed="rId5"/>
+                    <a:blip r:embed="rId7"/>
                     <a:stretch>
                       <a:fillRect/>
                     </a:stretch>
@@ -194,6 +222,7 @@
       <w:r>
         <w:rPr>
           <w:rFonts w:asciiTheme="majorBidi" w:hAnsiTheme="majorBidi" w:cstheme="majorBidi"/>
+          <w:noProof/>
         </w:rPr>
         <w:drawing>
           <wp:inline distT="0" distB="0" distL="0" distR="0" wp14:anchorId="2FF64D24" wp14:editId="11ACDCEE">
@@ -211,7 +240,7 @@
                     <pic:cNvPicPr/>
                   </pic:nvPicPr>
                   <pic:blipFill>
-                    <a:blip r:embed="rId6"/>
+                    <a:blip r:embed="rId8"/>
                     <a:stretch>
                       <a:fillRect/>
                     </a:stretch>
@@ -256,6 +285,7 @@
       <w:r>
         <w:rPr>
           <w:rFonts w:asciiTheme="majorBidi" w:hAnsiTheme="majorBidi" w:cstheme="majorBidi"/>
+          <w:noProof/>
         </w:rPr>
         <w:drawing>
           <wp:inline distT="0" distB="0" distL="0" distR="0" wp14:anchorId="3A3A55A7" wp14:editId="08D3BFF8">
@@ -273,7 +303,7 @@
                     <pic:cNvPicPr/>
                   </pic:nvPicPr>
                   <pic:blipFill>
-                    <a:blip r:embed="rId7"/>
+                    <a:blip r:embed="rId9"/>
                     <a:stretch>
                       <a:fillRect/>
                     </a:stretch>
@@ -317,6 +347,7 @@
       <w:r>
         <w:rPr>
           <w:rFonts w:asciiTheme="majorBidi" w:hAnsiTheme="majorBidi" w:cstheme="majorBidi"/>
+          <w:noProof/>
         </w:rPr>
         <w:drawing>
           <wp:inline distT="0" distB="0" distL="0" distR="0" wp14:anchorId="106DE65D" wp14:editId="740902FC">
@@ -334,7 +365,7 @@
                     <pic:cNvPicPr/>
                   </pic:nvPicPr>
                   <pic:blipFill>
-                    <a:blip r:embed="rId8"/>
+                    <a:blip r:embed="rId10"/>
                     <a:stretch>
                       <a:fillRect/>
                     </a:stretch>
@@ -365,16 +396,33 @@
     <w:p>
       <w:pPr>
         <w:pStyle w:val="Subtitle"/>
-      </w:pPr>
-      <w:r>
+        <w:rPr>
+          <w:rFonts w:asciiTheme="majorBidi" w:hAnsiTheme="majorBidi"/>
+        </w:rPr>
+      </w:pPr>
+      <w:r>
+        <w:rPr>
+          <w:rFonts w:asciiTheme="majorBidi" w:hAnsiTheme="majorBidi"/>
+        </w:rPr>
         <w:t>Alter Tables</w:t>
       </w:r>
     </w:p>
     <w:p>
-      <w:r>
+      <w:pPr>
+        <w:rPr>
+          <w:rFonts w:asciiTheme="majorBidi" w:hAnsiTheme="majorBidi" w:cstheme="majorBidi"/>
+        </w:rPr>
+      </w:pPr>
+      <w:r>
+        <w:rPr>
+          <w:rFonts w:asciiTheme="majorBidi" w:hAnsiTheme="majorBidi" w:cstheme="majorBidi"/>
+        </w:rPr>
         <w:t>INVESTOR Table</w:t>
       </w:r>
       <w:r>
+        <w:rPr>
+          <w:rFonts w:asciiTheme="majorBidi" w:hAnsiTheme="majorBidi" w:cstheme="majorBidi"/>
+        </w:rPr>
         <w:t xml:space="preserve"> – No alter change</w:t>
       </w:r>
     </w:p>
@@ -388,6 +436,7 @@
       <w:r>
         <w:rPr>
           <w:rFonts w:asciiTheme="majorBidi" w:hAnsiTheme="majorBidi" w:cstheme="majorBidi"/>
+          <w:noProof/>
         </w:rPr>
         <w:drawing>
           <wp:inline distT="0" distB="0" distL="0" distR="0" wp14:anchorId="21D70448" wp14:editId="50CC0DBB">
@@ -405,7 +454,7 @@
                     <pic:cNvPicPr/>
                   </pic:nvPicPr>
                   <pic:blipFill>
-                    <a:blip r:embed="rId9"/>
+                    <a:blip r:embed="rId11"/>
                     <a:stretch>
                       <a:fillRect/>
                     </a:stretch>
@@ -449,6 +498,7 @@
       <w:r>
         <w:rPr>
           <w:rFonts w:asciiTheme="majorBidi" w:hAnsiTheme="majorBidi" w:cstheme="majorBidi"/>
+          <w:noProof/>
         </w:rPr>
         <w:drawing>
           <wp:inline distT="0" distB="0" distL="0" distR="0" wp14:anchorId="06202FD9" wp14:editId="1BD85A98">
@@ -466,7 +516,7 @@
                     <pic:cNvPicPr/>
                   </pic:nvPicPr>
                   <pic:blipFill>
-                    <a:blip r:embed="rId10"/>
+                    <a:blip r:embed="rId12"/>
                     <a:stretch>
                       <a:fillRect/>
                     </a:stretch>
@@ -533,6 +583,7 @@
       <w:r>
         <w:rPr>
           <w:rFonts w:asciiTheme="majorBidi" w:hAnsiTheme="majorBidi" w:cstheme="majorBidi"/>
+          <w:noProof/>
         </w:rPr>
         <w:drawing>
           <wp:inline distT="0" distB="0" distL="0" distR="0" wp14:anchorId="18A8537A" wp14:editId="2C14D583">
@@ -550,7 +601,7 @@
                     <pic:cNvPicPr/>
                   </pic:nvPicPr>
                   <pic:blipFill>
-                    <a:blip r:embed="rId11"/>
+                    <a:blip r:embed="rId13"/>
                     <a:stretch>
                       <a:fillRect/>
                     </a:stretch>
@@ -594,6 +645,7 @@
       <w:r>
         <w:rPr>
           <w:rFonts w:asciiTheme="majorBidi" w:hAnsiTheme="majorBidi" w:cstheme="majorBidi"/>
+          <w:noProof/>
         </w:rPr>
         <w:drawing>
           <wp:inline distT="0" distB="0" distL="0" distR="0" wp14:anchorId="51EAAF69" wp14:editId="29F43B02">
@@ -611,7 +663,7 @@
                     <pic:cNvPicPr/>
                   </pic:nvPicPr>
                   <pic:blipFill>
-                    <a:blip r:embed="rId12"/>
+                    <a:blip r:embed="rId14"/>
                     <a:stretch>
                       <a:fillRect/>
                     </a:stretch>
@@ -655,6 +707,7 @@
       <w:r>
         <w:rPr>
           <w:rFonts w:asciiTheme="majorBidi" w:hAnsiTheme="majorBidi" w:cstheme="majorBidi"/>
+          <w:noProof/>
         </w:rPr>
         <w:drawing>
           <wp:inline distT="0" distB="0" distL="0" distR="0" wp14:anchorId="30735229" wp14:editId="4649866F">
@@ -672,7 +725,7 @@
                     <pic:cNvPicPr/>
                   </pic:nvPicPr>
                   <pic:blipFill>
-                    <a:blip r:embed="rId13"/>
+                    <a:blip r:embed="rId15"/>
                     <a:stretch>
                       <a:fillRect/>
                     </a:stretch>
@@ -696,26 +749,50 @@
     <w:p>
       <w:pPr>
         <w:pStyle w:val="Subtitle"/>
+        <w:rPr>
+          <w:rFonts w:asciiTheme="majorBidi" w:hAnsiTheme="majorBidi"/>
+        </w:rPr>
       </w:pPr>
     </w:p>
     <w:p>
       <w:pPr>
         <w:pStyle w:val="Subtitle"/>
-      </w:pPr>
-      <w:r>
+        <w:rPr>
+          <w:rFonts w:asciiTheme="majorBidi" w:hAnsiTheme="majorBidi"/>
+        </w:rPr>
+      </w:pPr>
+      <w:r>
+        <w:rPr>
+          <w:rFonts w:asciiTheme="majorBidi" w:hAnsiTheme="majorBidi"/>
+        </w:rPr>
         <w:t>After Data Insertion</w:t>
       </w:r>
     </w:p>
     <w:p>
-      <w:r>
+      <w:pPr>
+        <w:rPr>
+          <w:rFonts w:asciiTheme="majorBidi" w:hAnsiTheme="majorBidi" w:cstheme="majorBidi"/>
+        </w:rPr>
+      </w:pPr>
+      <w:r>
+        <w:rPr>
+          <w:rFonts w:asciiTheme="majorBidi" w:hAnsiTheme="majorBidi" w:cstheme="majorBidi"/>
+        </w:rPr>
         <w:t>INVESTOR Table</w:t>
       </w:r>
     </w:p>
     <w:p>
       <w:pPr>
         <w:jc w:val="center"/>
-      </w:pPr>
-      <w:r>
+        <w:rPr>
+          <w:rFonts w:asciiTheme="majorBidi" w:hAnsiTheme="majorBidi" w:cstheme="majorBidi"/>
+        </w:rPr>
+      </w:pPr>
+      <w:r>
+        <w:rPr>
+          <w:rFonts w:asciiTheme="majorBidi" w:hAnsiTheme="majorBidi" w:cstheme="majorBidi"/>
+          <w:noProof/>
+        </w:rPr>
         <w:drawing>
           <wp:inline distT="0" distB="0" distL="0" distR="0" wp14:anchorId="78637869" wp14:editId="5A159A56">
             <wp:extent cx="3167562" cy="1598313"/>
@@ -732,7 +809,7 @@
                     <pic:cNvPicPr/>
                   </pic:nvPicPr>
                   <pic:blipFill>
-                    <a:blip r:embed="rId14"/>
+                    <a:blip r:embed="rId16"/>
                     <a:stretch>
                       <a:fillRect/>
                     </a:stretch>
@@ -777,6 +854,7 @@
       <w:r>
         <w:rPr>
           <w:rFonts w:asciiTheme="majorBidi" w:hAnsiTheme="majorBidi" w:cstheme="majorBidi"/>
+          <w:noProof/>
         </w:rPr>
         <w:drawing>
           <wp:inline distT="0" distB="0" distL="0" distR="0" wp14:anchorId="318B6123" wp14:editId="6A5F914D">
@@ -794,7 +872,7 @@
                     <pic:cNvPicPr/>
                   </pic:nvPicPr>
                   <pic:blipFill>
-                    <a:blip r:embed="rId15"/>
+                    <a:blip r:embed="rId17"/>
                     <a:stretch>
                       <a:fillRect/>
                     </a:stretch>
@@ -838,6 +916,7 @@
       <w:r>
         <w:rPr>
           <w:rFonts w:asciiTheme="majorBidi" w:hAnsiTheme="majorBidi" w:cstheme="majorBidi"/>
+          <w:noProof/>
         </w:rPr>
         <w:drawing>
           <wp:inline distT="0" distB="0" distL="0" distR="0" wp14:anchorId="385D9477" wp14:editId="59254451">
@@ -855,7 +934,7 @@
                     <pic:cNvPicPr/>
                   </pic:nvPicPr>
                   <pic:blipFill>
-                    <a:blip r:embed="rId16"/>
+                    <a:blip r:embed="rId18"/>
                     <a:stretch>
                       <a:fillRect/>
                     </a:stretch>
@@ -899,6 +978,7 @@
       <w:r>
         <w:rPr>
           <w:rFonts w:asciiTheme="majorBidi" w:hAnsiTheme="majorBidi" w:cstheme="majorBidi"/>
+          <w:noProof/>
         </w:rPr>
         <w:drawing>
           <wp:inline distT="0" distB="0" distL="0" distR="0" wp14:anchorId="74D14ECF" wp14:editId="4779F9C8">
@@ -916,7 +996,7 @@
                     <pic:cNvPicPr/>
                   </pic:nvPicPr>
                   <pic:blipFill>
-                    <a:blip r:embed="rId17"/>
+                    <a:blip r:embed="rId19"/>
                     <a:stretch>
                       <a:fillRect/>
                     </a:stretch>
@@ -960,6 +1040,7 @@
       <w:r>
         <w:rPr>
           <w:rFonts w:asciiTheme="majorBidi" w:hAnsiTheme="majorBidi" w:cstheme="majorBidi"/>
+          <w:noProof/>
         </w:rPr>
         <w:drawing>
           <wp:inline distT="0" distB="0" distL="0" distR="0" wp14:anchorId="51E56221" wp14:editId="114556F1">
@@ -977,7 +1058,7 @@
                     <pic:cNvPicPr/>
                   </pic:nvPicPr>
                   <pic:blipFill>
-                    <a:blip r:embed="rId18"/>
+                    <a:blip r:embed="rId20"/>
                     <a:stretch>
                       <a:fillRect/>
                     </a:stretch>
@@ -1001,27 +1082,56 @@
     <w:p>
       <w:pPr>
         <w:pStyle w:val="Subtitle"/>
-      </w:pPr>
-      <w:r>
+        <w:rPr>
+          <w:rFonts w:asciiTheme="majorBidi" w:hAnsiTheme="majorBidi"/>
+        </w:rPr>
+      </w:pPr>
+      <w:r>
+        <w:rPr>
+          <w:rFonts w:asciiTheme="majorBidi" w:hAnsiTheme="majorBidi"/>
+        </w:rPr>
         <w:lastRenderedPageBreak/>
         <w:t>New Data insertion from the GUI</w:t>
       </w:r>
     </w:p>
     <w:p>
-      <w:r>
+      <w:pPr>
+        <w:rPr>
+          <w:rFonts w:asciiTheme="majorBidi" w:hAnsiTheme="majorBidi" w:cstheme="majorBidi"/>
+        </w:rPr>
+      </w:pPr>
+      <w:r>
+        <w:rPr>
+          <w:rFonts w:asciiTheme="majorBidi" w:hAnsiTheme="majorBidi" w:cstheme="majorBidi"/>
+        </w:rPr>
         <w:t>INVESTOR Table</w:t>
       </w:r>
     </w:p>
     <w:p>
-      <w:r>
+      <w:pPr>
+        <w:rPr>
+          <w:rFonts w:asciiTheme="majorBidi" w:hAnsiTheme="majorBidi" w:cstheme="majorBidi"/>
+        </w:rPr>
+      </w:pPr>
+      <w:r>
+        <w:rPr>
+          <w:rFonts w:asciiTheme="majorBidi" w:hAnsiTheme="majorBidi" w:cstheme="majorBidi"/>
+        </w:rPr>
         <w:t>Before:</w:t>
       </w:r>
     </w:p>
     <w:p>
       <w:pPr>
         <w:jc w:val="center"/>
-      </w:pPr>
-      <w:r>
+        <w:rPr>
+          <w:rFonts w:asciiTheme="majorBidi" w:hAnsiTheme="majorBidi" w:cstheme="majorBidi"/>
+        </w:rPr>
+      </w:pPr>
+      <w:r>
+        <w:rPr>
+          <w:rFonts w:asciiTheme="majorBidi" w:hAnsiTheme="majorBidi" w:cstheme="majorBidi"/>
+          <w:noProof/>
+        </w:rPr>
         <w:drawing>
           <wp:inline distT="0" distB="0" distL="0" distR="0" wp14:anchorId="248784E0" wp14:editId="7E015937">
             <wp:extent cx="3167562" cy="1598313"/>
@@ -1038,7 +1148,7 @@
                     <pic:cNvPicPr/>
                   </pic:nvPicPr>
                   <pic:blipFill>
-                    <a:blip r:embed="rId14"/>
+                    <a:blip r:embed="rId16"/>
                     <a:stretch>
                       <a:fillRect/>
                     </a:stretch>
@@ -1060,7 +1170,15 @@
       </w:r>
     </w:p>
     <w:p>
-      <w:r>
+      <w:pPr>
+        <w:rPr>
+          <w:rFonts w:asciiTheme="majorBidi" w:hAnsiTheme="majorBidi" w:cstheme="majorBidi"/>
+        </w:rPr>
+      </w:pPr>
+      <w:r>
+        <w:rPr>
+          <w:rFonts w:asciiTheme="majorBidi" w:hAnsiTheme="majorBidi" w:cstheme="majorBidi"/>
+        </w:rPr>
         <w:t>After:</w:t>
       </w:r>
     </w:p>
@@ -1074,6 +1192,7 @@
       <w:r>
         <w:rPr>
           <w:rFonts w:asciiTheme="majorBidi" w:hAnsiTheme="majorBidi" w:cstheme="majorBidi"/>
+          <w:noProof/>
         </w:rPr>
         <w:drawing>
           <wp:inline distT="0" distB="0" distL="0" distR="0" wp14:anchorId="052022FD" wp14:editId="3CEAEAA6">
@@ -1091,7 +1210,7 @@
                     <pic:cNvPicPr/>
                   </pic:nvPicPr>
                   <pic:blipFill>
-                    <a:blip r:embed="rId19"/>
+                    <a:blip r:embed="rId21"/>
                     <a:stretch>
                       <a:fillRect/>
                     </a:stretch>
@@ -1122,6 +1241,7 @@
       <w:r>
         <w:rPr>
           <w:rFonts w:asciiTheme="majorBidi" w:hAnsiTheme="majorBidi" w:cstheme="majorBidi"/>
+          <w:noProof/>
         </w:rPr>
         <w:lastRenderedPageBreak/>
         <w:drawing>
@@ -1140,7 +1260,7 @@
                     <pic:cNvPicPr/>
                   </pic:nvPicPr>
                   <pic:blipFill>
-                    <a:blip r:embed="rId20"/>
+                    <a:blip r:embed="rId22"/>
                     <a:stretch>
                       <a:fillRect/>
                     </a:stretch>
@@ -1171,6 +1291,7 @@
       <w:r>
         <w:rPr>
           <w:rFonts w:asciiTheme="majorBidi" w:hAnsiTheme="majorBidi" w:cstheme="majorBidi"/>
+          <w:noProof/>
         </w:rPr>
         <w:drawing>
           <wp:inline distT="0" distB="0" distL="0" distR="0" wp14:anchorId="78E85900" wp14:editId="28956FA6">
@@ -1188,7 +1309,7 @@
                     <pic:cNvPicPr/>
                   </pic:nvPicPr>
                   <pic:blipFill>
-                    <a:blip r:embed="rId21"/>
+                    <a:blip r:embed="rId23"/>
                     <a:stretch>
                       <a:fillRect/>
                     </a:stretch>
@@ -1245,6 +1366,7 @@
       <w:r>
         <w:rPr>
           <w:rFonts w:asciiTheme="majorBidi" w:hAnsiTheme="majorBidi" w:cstheme="majorBidi"/>
+          <w:noProof/>
         </w:rPr>
         <w:drawing>
           <wp:inline distT="0" distB="0" distL="0" distR="0" wp14:anchorId="6518BF31" wp14:editId="016BB204">
@@ -1262,7 +1384,7 @@
                     <pic:cNvPicPr/>
                   </pic:nvPicPr>
                   <pic:blipFill>
-                    <a:blip r:embed="rId16"/>
+                    <a:blip r:embed="rId18"/>
                     <a:stretch>
                       <a:fillRect/>
                     </a:stretch>
@@ -1306,6 +1428,7 @@
       <w:r>
         <w:rPr>
           <w:rFonts w:asciiTheme="majorBidi" w:hAnsiTheme="majorBidi" w:cstheme="majorBidi"/>
+          <w:noProof/>
         </w:rPr>
         <w:lastRenderedPageBreak/>
         <w:drawing>
@@ -1324,7 +1447,7 @@
                     <pic:cNvPicPr/>
                   </pic:nvPicPr>
                   <pic:blipFill>
-                    <a:blip r:embed="rId22"/>
+                    <a:blip r:embed="rId24"/>
                     <a:stretch>
                       <a:fillRect/>
                     </a:stretch>
@@ -1355,6 +1478,7 @@
       <w:r>
         <w:rPr>
           <w:rFonts w:asciiTheme="majorBidi" w:hAnsiTheme="majorBidi" w:cstheme="majorBidi"/>
+          <w:noProof/>
         </w:rPr>
         <w:drawing>
           <wp:inline distT="0" distB="0" distL="0" distR="0" wp14:anchorId="45054646" wp14:editId="7665CF75">
@@ -1372,7 +1496,7 @@
                     <pic:cNvPicPr/>
                   </pic:nvPicPr>
                   <pic:blipFill>
-                    <a:blip r:embed="rId23"/>
+                    <a:blip r:embed="rId25"/>
                     <a:stretch>
                       <a:fillRect/>
                     </a:stretch>
@@ -1403,6 +1527,7 @@
       <w:r>
         <w:rPr>
           <w:rFonts w:asciiTheme="majorBidi" w:hAnsiTheme="majorBidi" w:cstheme="majorBidi"/>
+          <w:noProof/>
         </w:rPr>
         <w:drawing>
           <wp:inline distT="0" distB="0" distL="0" distR="0" wp14:anchorId="12E6F16D" wp14:editId="57871264">
@@ -1420,7 +1545,7 @@
                     <pic:cNvPicPr/>
                   </pic:nvPicPr>
                   <pic:blipFill>
-                    <a:blip r:embed="rId24"/>
+                    <a:blip r:embed="rId26"/>
                     <a:stretch>
                       <a:fillRect/>
                     </a:stretch>
@@ -1477,6 +1602,7 @@
       <w:r>
         <w:rPr>
           <w:rFonts w:asciiTheme="majorBidi" w:hAnsiTheme="majorBidi" w:cstheme="majorBidi"/>
+          <w:noProof/>
         </w:rPr>
         <w:lastRenderedPageBreak/>
         <w:drawing>
@@ -1495,7 +1621,7 @@
                     <pic:cNvPicPr/>
                   </pic:nvPicPr>
                   <pic:blipFill>
-                    <a:blip r:embed="rId17"/>
+                    <a:blip r:embed="rId19"/>
                     <a:stretch>
                       <a:fillRect/>
                     </a:stretch>
@@ -1539,6 +1665,7 @@
       <w:r>
         <w:rPr>
           <w:rFonts w:asciiTheme="majorBidi" w:hAnsiTheme="majorBidi" w:cstheme="majorBidi"/>
+          <w:noProof/>
         </w:rPr>
         <w:drawing>
           <wp:inline distT="0" distB="0" distL="0" distR="0" wp14:anchorId="33864F23" wp14:editId="4296B334">
@@ -1556,7 +1683,7 @@
                     <pic:cNvPicPr/>
                   </pic:nvPicPr>
                   <pic:blipFill>
-                    <a:blip r:embed="rId25"/>
+                    <a:blip r:embed="rId27"/>
                     <a:stretch>
                       <a:fillRect/>
                     </a:stretch>
@@ -1587,6 +1714,7 @@
       <w:r>
         <w:rPr>
           <w:rFonts w:asciiTheme="majorBidi" w:hAnsiTheme="majorBidi" w:cstheme="majorBidi"/>
+          <w:noProof/>
         </w:rPr>
         <w:drawing>
           <wp:inline distT="0" distB="0" distL="0" distR="0" wp14:anchorId="1B1B6CC4" wp14:editId="06285068">
@@ -1604,7 +1732,7 @@
                     <pic:cNvPicPr/>
                   </pic:nvPicPr>
                   <pic:blipFill>
-                    <a:blip r:embed="rId26"/>
+                    <a:blip r:embed="rId28"/>
                     <a:stretch>
                       <a:fillRect/>
                     </a:stretch>
@@ -1635,6 +1763,7 @@
       <w:r>
         <w:rPr>
           <w:rFonts w:asciiTheme="majorBidi" w:hAnsiTheme="majorBidi" w:cstheme="majorBidi"/>
+          <w:noProof/>
         </w:rPr>
         <w:lastRenderedPageBreak/>
         <w:drawing>
@@ -1653,7 +1782,7 @@
                     <pic:cNvPicPr/>
                   </pic:nvPicPr>
                   <pic:blipFill>
-                    <a:blip r:embed="rId27"/>
+                    <a:blip r:embed="rId29"/>
                     <a:stretch>
                       <a:fillRect/>
                     </a:stretch>
@@ -1685,28 +1814,54 @@
     <w:p>
       <w:pPr>
         <w:pStyle w:val="Subtitle"/>
-      </w:pPr>
-      <w:r>
+        <w:rPr>
+          <w:rFonts w:asciiTheme="majorBidi" w:hAnsiTheme="majorBidi"/>
+        </w:rPr>
+      </w:pPr>
+      <w:r>
+        <w:rPr>
+          <w:rFonts w:asciiTheme="majorBidi" w:hAnsiTheme="majorBidi"/>
+        </w:rPr>
         <w:t>Modify Tables From the GUI</w:t>
       </w:r>
     </w:p>
     <w:p>
-      <w:r>
+      <w:pPr>
+        <w:rPr>
+          <w:rFonts w:asciiTheme="majorBidi" w:hAnsiTheme="majorBidi" w:cstheme="majorBidi"/>
+        </w:rPr>
+      </w:pPr>
+      <w:r>
+        <w:rPr>
+          <w:rFonts w:asciiTheme="majorBidi" w:hAnsiTheme="majorBidi" w:cstheme="majorBidi"/>
+        </w:rPr>
         <w:t>INVESTOR Table</w:t>
       </w:r>
     </w:p>
     <w:p>
-      <w:r>
+      <w:pPr>
+        <w:rPr>
+          <w:rFonts w:asciiTheme="majorBidi" w:hAnsiTheme="majorBidi" w:cstheme="majorBidi"/>
+        </w:rPr>
+      </w:pPr>
+      <w:r>
+        <w:rPr>
+          <w:rFonts w:asciiTheme="majorBidi" w:hAnsiTheme="majorBidi" w:cstheme="majorBidi"/>
+        </w:rPr>
         <w:t>Before:</w:t>
       </w:r>
     </w:p>
     <w:p>
       <w:pPr>
         <w:jc w:val="center"/>
-      </w:pPr>
-      <w:r>
-        <w:rPr>
-          <w:rFonts w:asciiTheme="majorBidi" w:hAnsiTheme="majorBidi" w:cstheme="majorBidi"/>
+        <w:rPr>
+          <w:rFonts w:asciiTheme="majorBidi" w:hAnsiTheme="majorBidi" w:cstheme="majorBidi"/>
+        </w:rPr>
+      </w:pPr>
+      <w:r>
+        <w:rPr>
+          <w:rFonts w:asciiTheme="majorBidi" w:hAnsiTheme="majorBidi" w:cstheme="majorBidi"/>
+          <w:noProof/>
         </w:rPr>
         <w:drawing>
           <wp:inline distT="0" distB="0" distL="0" distR="0" wp14:anchorId="3113868D" wp14:editId="551D9EA5">
@@ -1724,7 +1879,7 @@
                     <pic:cNvPicPr/>
                   </pic:nvPicPr>
                   <pic:blipFill>
-                    <a:blip r:embed="rId21"/>
+                    <a:blip r:embed="rId23"/>
                     <a:stretch>
                       <a:fillRect/>
                     </a:stretch>
@@ -1746,7 +1901,15 @@
       </w:r>
     </w:p>
     <w:p>
-      <w:r>
+      <w:pPr>
+        <w:rPr>
+          <w:rFonts w:asciiTheme="majorBidi" w:hAnsiTheme="majorBidi" w:cstheme="majorBidi"/>
+        </w:rPr>
+      </w:pPr>
+      <w:r>
+        <w:rPr>
+          <w:rFonts w:asciiTheme="majorBidi" w:hAnsiTheme="majorBidi" w:cstheme="majorBidi"/>
+        </w:rPr>
         <w:t>After:</w:t>
       </w:r>
     </w:p>
@@ -1760,6 +1923,7 @@
       <w:r>
         <w:rPr>
           <w:rFonts w:asciiTheme="majorBidi" w:hAnsiTheme="majorBidi" w:cstheme="majorBidi"/>
+          <w:noProof/>
         </w:rPr>
         <w:drawing>
           <wp:inline distT="0" distB="0" distL="0" distR="0" wp14:anchorId="31F4498A" wp14:editId="03B5F633">
@@ -1777,7 +1941,7 @@
                     <pic:cNvPicPr/>
                   </pic:nvPicPr>
                   <pic:blipFill>
-                    <a:blip r:embed="rId28"/>
+                    <a:blip r:embed="rId30"/>
                     <a:stretch>
                       <a:fillRect/>
                     </a:stretch>
@@ -1808,6 +1972,7 @@
       <w:r>
         <w:rPr>
           <w:rFonts w:asciiTheme="majorBidi" w:hAnsiTheme="majorBidi" w:cstheme="majorBidi"/>
+          <w:noProof/>
         </w:rPr>
         <w:lastRenderedPageBreak/>
         <w:drawing>
@@ -1826,7 +1991,7 @@
                     <pic:cNvPicPr/>
                   </pic:nvPicPr>
                   <pic:blipFill>
-                    <a:blip r:embed="rId29"/>
+                    <a:blip r:embed="rId31"/>
                     <a:stretch>
                       <a:fillRect/>
                     </a:stretch>
@@ -1859,6 +2024,7 @@
       <w:r>
         <w:rPr>
           <w:rFonts w:asciiTheme="majorBidi" w:hAnsiTheme="majorBidi" w:cstheme="majorBidi"/>
+          <w:noProof/>
           <w:lang w:bidi="ar-SY"/>
         </w:rPr>
         <w:drawing>
@@ -1877,7 +2043,7 @@
                     <pic:cNvPicPr/>
                   </pic:nvPicPr>
                   <pic:blipFill>
-                    <a:blip r:embed="rId30"/>
+                    <a:blip r:embed="rId32"/>
                     <a:stretch>
                       <a:fillRect/>
                     </a:stretch>
@@ -1910,6 +2076,7 @@
       <w:r>
         <w:rPr>
           <w:rFonts w:asciiTheme="majorBidi" w:hAnsiTheme="majorBidi" w:cstheme="majorBidi"/>
+          <w:noProof/>
           <w:lang w:bidi="ar-SY"/>
         </w:rPr>
         <w:lastRenderedPageBreak/>
@@ -1929,7 +2096,7 @@
                     <pic:cNvPicPr/>
                   </pic:nvPicPr>
                   <pic:blipFill>
-                    <a:blip r:embed="rId31"/>
+                    <a:blip r:embed="rId33"/>
                     <a:stretch>
                       <a:fillRect/>
                     </a:stretch>
@@ -1954,7 +2121,7 @@
       <w:pPr>
         <w:jc w:val="center"/>
         <w:rPr>
-          <w:rFonts w:asciiTheme="majorBidi" w:hAnsiTheme="majorBidi" w:cstheme="majorBidi" w:hint="cs"/>
+          <w:rFonts w:asciiTheme="majorBidi" w:hAnsiTheme="majorBidi" w:cstheme="majorBidi"/>
           <w:rtl/>
           <w:lang w:bidi="ar-SY"/>
         </w:rPr>
@@ -1962,6 +2129,7 @@
       <w:r>
         <w:rPr>
           <w:rFonts w:asciiTheme="majorBidi" w:hAnsiTheme="majorBidi" w:cstheme="majorBidi"/>
+          <w:noProof/>
           <w:lang w:bidi="ar-SY"/>
         </w:rPr>
         <w:drawing>
@@ -1980,7 +2148,7 @@
                     <pic:cNvPicPr/>
                   </pic:nvPicPr>
                   <pic:blipFill>
-                    <a:blip r:embed="rId32"/>
+                    <a:blip r:embed="rId34"/>
                     <a:stretch>
                       <a:fillRect/>
                     </a:stretch>
@@ -2053,6 +2221,7 @@
       <w:r>
         <w:rPr>
           <w:rFonts w:asciiTheme="majorBidi" w:hAnsiTheme="majorBidi" w:cstheme="majorBidi"/>
+          <w:noProof/>
         </w:rPr>
         <w:drawing>
           <wp:inline distT="0" distB="0" distL="0" distR="0" wp14:anchorId="5F573A3B" wp14:editId="3061CC0A">
@@ -2070,7 +2239,7 @@
                     <pic:cNvPicPr/>
                   </pic:nvPicPr>
                   <pic:blipFill>
-                    <a:blip r:embed="rId24"/>
+                    <a:blip r:embed="rId26"/>
                     <a:stretch>
                       <a:fillRect/>
                     </a:stretch>
@@ -2123,6 +2292,7 @@
       <w:r>
         <w:rPr>
           <w:rFonts w:asciiTheme="majorBidi" w:hAnsiTheme="majorBidi" w:cstheme="majorBidi"/>
+          <w:noProof/>
         </w:rPr>
         <w:lastRenderedPageBreak/>
         <w:drawing>
@@ -2141,7 +2311,7 @@
                     <pic:cNvPicPr/>
                   </pic:nvPicPr>
                   <pic:blipFill>
-                    <a:blip r:embed="rId33"/>
+                    <a:blip r:embed="rId35"/>
                     <a:stretch>
                       <a:fillRect/>
                     </a:stretch>
@@ -2172,6 +2342,7 @@
       <w:r>
         <w:rPr>
           <w:rFonts w:asciiTheme="majorBidi" w:hAnsiTheme="majorBidi" w:cstheme="majorBidi"/>
+          <w:noProof/>
         </w:rPr>
         <w:drawing>
           <wp:inline distT="0" distB="0" distL="0" distR="0" wp14:anchorId="7909669F" wp14:editId="78B2E81B">
@@ -2189,7 +2360,7 @@
                     <pic:cNvPicPr/>
                   </pic:nvPicPr>
                   <pic:blipFill>
-                    <a:blip r:embed="rId34"/>
+                    <a:blip r:embed="rId36"/>
                     <a:stretch>
                       <a:fillRect/>
                     </a:stretch>
@@ -2220,6 +2391,7 @@
       <w:r>
         <w:rPr>
           <w:rFonts w:asciiTheme="majorBidi" w:hAnsiTheme="majorBidi" w:cstheme="majorBidi"/>
+          <w:noProof/>
         </w:rPr>
         <w:lastRenderedPageBreak/>
         <w:drawing>
@@ -2238,7 +2410,7 @@
                     <pic:cNvPicPr/>
                   </pic:nvPicPr>
                   <pic:blipFill>
-                    <a:blip r:embed="rId35"/>
+                    <a:blip r:embed="rId37"/>
                     <a:stretch>
                       <a:fillRect/>
                     </a:stretch>
@@ -2269,6 +2441,7 @@
       <w:r>
         <w:rPr>
           <w:rFonts w:asciiTheme="majorBidi" w:hAnsiTheme="majorBidi" w:cstheme="majorBidi"/>
+          <w:noProof/>
         </w:rPr>
         <w:drawing>
           <wp:inline distT="0" distB="0" distL="0" distR="0" wp14:anchorId="69668D4E" wp14:editId="1E47DD8D">
@@ -2286,7 +2459,7 @@
                     <pic:cNvPicPr/>
                   </pic:nvPicPr>
                   <pic:blipFill>
-                    <a:blip r:embed="rId36"/>
+                    <a:blip r:embed="rId38"/>
                     <a:stretch>
                       <a:fillRect/>
                     </a:stretch>
@@ -2317,6 +2490,7 @@
       <w:r>
         <w:rPr>
           <w:rFonts w:asciiTheme="majorBidi" w:hAnsiTheme="majorBidi" w:cstheme="majorBidi"/>
+          <w:noProof/>
         </w:rPr>
         <w:drawing>
           <wp:inline distT="0" distB="0" distL="0" distR="0" wp14:anchorId="15C29CA5" wp14:editId="738795D8">
@@ -2334,7 +2508,7 @@
                     <pic:cNvPicPr/>
                   </pic:nvPicPr>
                   <pic:blipFill>
-                    <a:blip r:embed="rId37"/>
+                    <a:blip r:embed="rId39"/>
                     <a:stretch>
                       <a:fillRect/>
                     </a:stretch>
@@ -2400,6 +2574,7 @@
       <w:r>
         <w:rPr>
           <w:rFonts w:asciiTheme="majorBidi" w:hAnsiTheme="majorBidi" w:cstheme="majorBidi"/>
+          <w:noProof/>
         </w:rPr>
         <w:drawing>
           <wp:inline distT="0" distB="0" distL="0" distR="0" wp14:anchorId="6EE9C95E" wp14:editId="2C023E01">
@@ -2417,7 +2592,7 @@
                     <pic:cNvPicPr/>
                   </pic:nvPicPr>
                   <pic:blipFill>
-                    <a:blip r:embed="rId38"/>
+                    <a:blip r:embed="rId40"/>
                     <a:stretch>
                       <a:fillRect/>
                     </a:stretch>
@@ -2471,6 +2646,7 @@
       <w:r>
         <w:rPr>
           <w:rFonts w:asciiTheme="majorBidi" w:hAnsiTheme="majorBidi" w:cstheme="majorBidi"/>
+          <w:noProof/>
           <w:lang w:bidi="ar-SY"/>
         </w:rPr>
         <w:drawing>
@@ -2489,7 +2665,7 @@
                     <pic:cNvPicPr/>
                   </pic:nvPicPr>
                   <pic:blipFill>
-                    <a:blip r:embed="rId39"/>
+                    <a:blip r:embed="rId41"/>
                     <a:stretch>
                       <a:fillRect/>
                     </a:stretch>
@@ -2522,6 +2698,7 @@
       <w:r>
         <w:rPr>
           <w:rFonts w:asciiTheme="majorBidi" w:hAnsiTheme="majorBidi" w:cstheme="majorBidi"/>
+          <w:noProof/>
           <w:lang w:bidi="ar-SY"/>
         </w:rPr>
         <w:lastRenderedPageBreak/>
@@ -2541,7 +2718,7 @@
                     <pic:cNvPicPr/>
                   </pic:nvPicPr>
                   <pic:blipFill>
-                    <a:blip r:embed="rId40"/>
+                    <a:blip r:embed="rId42"/>
                     <a:stretch>
                       <a:fillRect/>
                     </a:stretch>
@@ -2574,6 +2751,7 @@
       <w:r>
         <w:rPr>
           <w:rFonts w:asciiTheme="majorBidi" w:hAnsiTheme="majorBidi" w:cstheme="majorBidi"/>
+          <w:noProof/>
           <w:lang w:bidi="ar-SY"/>
         </w:rPr>
         <w:drawing>
@@ -2592,7 +2770,7 @@
                     <pic:cNvPicPr/>
                   </pic:nvPicPr>
                   <pic:blipFill>
-                    <a:blip r:embed="rId41"/>
+                    <a:blip r:embed="rId43"/>
                     <a:stretch>
                       <a:fillRect/>
                     </a:stretch>
@@ -2625,6 +2803,7 @@
       <w:r>
         <w:rPr>
           <w:rFonts w:asciiTheme="majorBidi" w:hAnsiTheme="majorBidi" w:cstheme="majorBidi"/>
+          <w:noProof/>
           <w:lang w:bidi="ar-SY"/>
         </w:rPr>
         <w:lastRenderedPageBreak/>
@@ -2644,7 +2823,7 @@
                     <pic:cNvPicPr/>
                   </pic:nvPicPr>
                   <pic:blipFill>
-                    <a:blip r:embed="rId42"/>
+                    <a:blip r:embed="rId44"/>
                     <a:stretch>
                       <a:fillRect/>
                     </a:stretch>
@@ -2679,11 +2858,13 @@
       <w:pPr>
         <w:pStyle w:val="Subtitle"/>
         <w:rPr>
+          <w:rFonts w:asciiTheme="majorBidi" w:hAnsiTheme="majorBidi"/>
           <w:lang w:bidi="ar-SY"/>
         </w:rPr>
       </w:pPr>
       <w:r>
         <w:rPr>
+          <w:rFonts w:asciiTheme="majorBidi" w:hAnsiTheme="majorBidi"/>
           <w:lang w:bidi="ar-SY"/>
         </w:rPr>
         <w:t>Query 1</w:t>
@@ -2692,11 +2873,14 @@
     <w:p>
       <w:pPr>
         <w:rPr>
+          <w:rFonts w:asciiTheme="majorBidi" w:hAnsiTheme="majorBidi" w:cstheme="majorBidi"/>
           <w:lang w:bidi="ar-SY"/>
         </w:rPr>
       </w:pPr>
       <w:r>
         <w:rPr>
+          <w:rFonts w:asciiTheme="majorBidi" w:hAnsiTheme="majorBidi" w:cstheme="majorBidi"/>
+          <w:noProof/>
           <w:lang w:bidi="ar-SY"/>
         </w:rPr>
         <w:drawing>
@@ -2715,7 +2899,7 @@
                     <pic:cNvPicPr/>
                   </pic:nvPicPr>
                   <pic:blipFill>
-                    <a:blip r:embed="rId43"/>
+                    <a:blip r:embed="rId45"/>
                     <a:stretch>
                       <a:fillRect/>
                     </a:stretch>
@@ -2739,11 +2923,14 @@
     <w:p>
       <w:pPr>
         <w:rPr>
+          <w:rFonts w:asciiTheme="majorBidi" w:hAnsiTheme="majorBidi" w:cstheme="majorBidi"/>
           <w:lang w:bidi="ar-SY"/>
         </w:rPr>
       </w:pPr>
       <w:r>
         <w:rPr>
+          <w:rFonts w:asciiTheme="majorBidi" w:hAnsiTheme="majorBidi" w:cstheme="majorBidi"/>
+          <w:noProof/>
           <w:lang w:bidi="ar-SY"/>
         </w:rPr>
         <w:lastRenderedPageBreak/>
@@ -2763,7 +2950,7 @@
                     <pic:cNvPicPr/>
                   </pic:nvPicPr>
                   <pic:blipFill>
-                    <a:blip r:embed="rId44"/>
+                    <a:blip r:embed="rId46"/>
                     <a:stretch>
                       <a:fillRect/>
                     </a:stretch>
@@ -2787,11 +2974,14 @@
     <w:p>
       <w:pPr>
         <w:rPr>
+          <w:rFonts w:asciiTheme="majorBidi" w:hAnsiTheme="majorBidi" w:cstheme="majorBidi"/>
           <w:lang w:bidi="ar-SY"/>
         </w:rPr>
       </w:pPr>
       <w:r>
         <w:rPr>
+          <w:rFonts w:asciiTheme="majorBidi" w:hAnsiTheme="majorBidi" w:cstheme="majorBidi"/>
+          <w:noProof/>
           <w:lang w:bidi="ar-SY"/>
         </w:rPr>
         <w:drawing>
@@ -2810,7 +3000,7 @@
                     <pic:cNvPicPr/>
                   </pic:nvPicPr>
                   <pic:blipFill>
-                    <a:blip r:embed="rId45"/>
+                    <a:blip r:embed="rId47"/>
                     <a:stretch>
                       <a:fillRect/>
                     </a:stretch>
@@ -2834,11 +3024,14 @@
     <w:p>
       <w:pPr>
         <w:rPr>
+          <w:rFonts w:asciiTheme="majorBidi" w:hAnsiTheme="majorBidi" w:cstheme="majorBidi"/>
           <w:lang w:bidi="ar-SY"/>
         </w:rPr>
       </w:pPr>
       <w:r>
         <w:rPr>
+          <w:rFonts w:asciiTheme="majorBidi" w:hAnsiTheme="majorBidi" w:cstheme="majorBidi"/>
+          <w:noProof/>
           <w:lang w:bidi="ar-SY"/>
         </w:rPr>
         <w:lastRenderedPageBreak/>
@@ -2858,7 +3051,7 @@
                     <pic:cNvPicPr/>
                   </pic:nvPicPr>
                   <pic:blipFill>
-                    <a:blip r:embed="rId46"/>
+                    <a:blip r:embed="rId48"/>
                     <a:stretch>
                       <a:fillRect/>
                     </a:stretch>
@@ -2883,11 +3076,13 @@
       <w:pPr>
         <w:pStyle w:val="Subtitle"/>
         <w:rPr>
+          <w:rFonts w:asciiTheme="majorBidi" w:hAnsiTheme="majorBidi"/>
           <w:lang w:bidi="ar-SY"/>
         </w:rPr>
       </w:pPr>
       <w:r>
         <w:rPr>
+          <w:rFonts w:asciiTheme="majorBidi" w:hAnsiTheme="majorBidi"/>
           <w:lang w:bidi="ar-SY"/>
         </w:rPr>
         <w:t>Query 2</w:t>
@@ -2896,11 +3091,14 @@
     <w:p>
       <w:pPr>
         <w:rPr>
+          <w:rFonts w:asciiTheme="majorBidi" w:hAnsiTheme="majorBidi" w:cstheme="majorBidi"/>
           <w:lang w:bidi="ar-SY"/>
         </w:rPr>
       </w:pPr>
       <w:r>
         <w:rPr>
+          <w:rFonts w:asciiTheme="majorBidi" w:hAnsiTheme="majorBidi" w:cstheme="majorBidi"/>
+          <w:noProof/>
           <w:lang w:bidi="ar-SY"/>
         </w:rPr>
         <w:drawing>
@@ -2919,7 +3117,7 @@
                     <pic:cNvPicPr/>
                   </pic:nvPicPr>
                   <pic:blipFill>
-                    <a:blip r:embed="rId47"/>
+                    <a:blip r:embed="rId49"/>
                     <a:stretch>
                       <a:fillRect/>
                     </a:stretch>
@@ -2943,11 +3141,14 @@
     <w:p>
       <w:pPr>
         <w:rPr>
+          <w:rFonts w:asciiTheme="majorBidi" w:hAnsiTheme="majorBidi" w:cstheme="majorBidi"/>
           <w:lang w:bidi="ar-SY"/>
         </w:rPr>
       </w:pPr>
       <w:r>
         <w:rPr>
+          <w:rFonts w:asciiTheme="majorBidi" w:hAnsiTheme="majorBidi" w:cstheme="majorBidi"/>
+          <w:noProof/>
           <w:lang w:bidi="ar-SY"/>
         </w:rPr>
         <w:lastRenderedPageBreak/>
@@ -2967,7 +3168,7 @@
                     <pic:cNvPicPr/>
                   </pic:nvPicPr>
                   <pic:blipFill>
-                    <a:blip r:embed="rId48"/>
+                    <a:blip r:embed="rId50"/>
                     <a:stretch>
                       <a:fillRect/>
                     </a:stretch>
@@ -2991,11 +3192,14 @@
     <w:p>
       <w:pPr>
         <w:rPr>
+          <w:rFonts w:asciiTheme="majorBidi" w:hAnsiTheme="majorBidi" w:cstheme="majorBidi"/>
           <w:lang w:bidi="ar-SY"/>
         </w:rPr>
       </w:pPr>
       <w:r>
         <w:rPr>
+          <w:rFonts w:asciiTheme="majorBidi" w:hAnsiTheme="majorBidi" w:cstheme="majorBidi"/>
+          <w:noProof/>
           <w:lang w:bidi="ar-SY"/>
         </w:rPr>
         <w:drawing>
@@ -3014,7 +3218,7 @@
                     <pic:cNvPicPr/>
                   </pic:nvPicPr>
                   <pic:blipFill>
-                    <a:blip r:embed="rId49"/>
+                    <a:blip r:embed="rId51"/>
                     <a:stretch>
                       <a:fillRect/>
                     </a:stretch>
@@ -3038,11 +3242,14 @@
     <w:p>
       <w:pPr>
         <w:rPr>
+          <w:rFonts w:asciiTheme="majorBidi" w:hAnsiTheme="majorBidi" w:cstheme="majorBidi"/>
           <w:lang w:bidi="ar-SY"/>
         </w:rPr>
       </w:pPr>
       <w:r>
         <w:rPr>
+          <w:rFonts w:asciiTheme="majorBidi" w:hAnsiTheme="majorBidi" w:cstheme="majorBidi"/>
+          <w:noProof/>
           <w:lang w:bidi="ar-SY"/>
         </w:rPr>
         <w:lastRenderedPageBreak/>
@@ -3062,7 +3269,7 @@
                     <pic:cNvPicPr/>
                   </pic:nvPicPr>
                   <pic:blipFill>
-                    <a:blip r:embed="rId50"/>
+                    <a:blip r:embed="rId52"/>
                     <a:stretch>
                       <a:fillRect/>
                     </a:stretch>
@@ -3086,21 +3293,76 @@
     <w:p>
       <w:pPr>
         <w:rPr>
+          <w:rFonts w:asciiTheme="majorBidi" w:hAnsiTheme="majorBidi" w:cstheme="majorBidi"/>
           <w:lang w:bidi="ar-SY"/>
         </w:rPr>
       </w:pPr>
     </w:p>
     <w:p>
       <w:pPr>
-        <w:rPr>
-          <w:rFonts w:hint="cs"/>
-          <w:rtl/>
+        <w:pStyle w:val="Subtitle"/>
+        <w:rPr>
+          <w:rFonts w:asciiTheme="majorBidi" w:hAnsiTheme="majorBidi"/>
           <w:lang w:bidi="ar-SY"/>
         </w:rPr>
       </w:pPr>
-    </w:p>
-    <w:p/>
+      <w:r>
+        <w:rPr>
+          <w:rFonts w:asciiTheme="majorBidi" w:hAnsiTheme="majorBidi"/>
+          <w:lang w:bidi="ar-SY"/>
+        </w:rPr>
+        <w:t>Database Connection</w:t>
+      </w:r>
+    </w:p>
+    <w:p>
+      <w:pPr>
+        <w:rPr>
+          <w:rFonts w:asciiTheme="majorBidi" w:hAnsiTheme="majorBidi" w:cstheme="majorBidi"/>
+        </w:rPr>
+      </w:pPr>
+      <w:r>
+        <w:rPr>
+          <w:rFonts w:asciiTheme="majorBidi" w:hAnsiTheme="majorBidi" w:cstheme="majorBidi"/>
+        </w:rPr>
+        <w:drawing>
+          <wp:inline distT="0" distB="0" distL="0" distR="0" wp14:anchorId="569A203F" wp14:editId="7D353532">
+            <wp:extent cx="5943600" cy="3531235"/>
+            <wp:effectExtent l="0" t="0" r="0" b="0"/>
+            <wp:docPr id="1595325904" name="Picture 1"/>
+            <wp:cNvGraphicFramePr>
+              <a:graphicFrameLocks xmlns:a="http://schemas.openxmlformats.org/drawingml/2006/main" noChangeAspect="1"/>
+            </wp:cNvGraphicFramePr>
+            <a:graphic xmlns:a="http://schemas.openxmlformats.org/drawingml/2006/main">
+              <a:graphicData uri="http://schemas.openxmlformats.org/drawingml/2006/picture">
+                <pic:pic xmlns:pic="http://schemas.openxmlformats.org/drawingml/2006/picture">
+                  <pic:nvPicPr>
+                    <pic:cNvPr id="1595325904" name=""/>
+                    <pic:cNvPicPr/>
+                  </pic:nvPicPr>
+                  <pic:blipFill>
+                    <a:blip r:embed="rId53"/>
+                    <a:stretch>
+                      <a:fillRect/>
+                    </a:stretch>
+                  </pic:blipFill>
+                  <pic:spPr>
+                    <a:xfrm>
+                      <a:off x="0" y="0"/>
+                      <a:ext cx="5943600" cy="3531235"/>
+                    </a:xfrm>
+                    <a:prstGeom prst="rect">
+                      <a:avLst/>
+                    </a:prstGeom>
+                  </pic:spPr>
+                </pic:pic>
+              </a:graphicData>
+            </a:graphic>
+          </wp:inline>
+        </w:drawing>
+      </w:r>
+    </w:p>
     <w:sectPr>
+      <w:footerReference w:type="default" r:id="rId54"/>
       <w:pgSz w:w="12240" w:h="15840"/>
       <w:pgMar w:top="1440" w:right="1440" w:bottom="1440" w:left="1440" w:header="720" w:footer="720" w:gutter="0"/>
       <w:cols w:space="720"/>
@@ -3108,6 +3370,109 @@
     </w:sectPr>
   </w:body>
 </w:document>
+</file>
+
+<file path=word/endnotes.xml><?xml version="1.0" encoding="utf-8"?>
+<w:endnotes xmlns:wpc="http://schemas.microsoft.com/office/word/2010/wordprocessingCanvas" xmlns:cx="http://schemas.microsoft.com/office/drawing/2014/chartex" xmlns:cx1="http://schemas.microsoft.com/office/drawing/2015/9/8/chartex" xmlns:cx2="http://schemas.microsoft.com/office/drawing/2015/10/21/chartex" xmlns:cx3="http://schemas.microsoft.com/office/drawing/2016/5/9/chartex" xmlns:cx4="http://schemas.microsoft.com/office/drawing/2016/5/10/chartex" xmlns:cx5="http://schemas.microsoft.com/office/drawing/2016/5/11/chartex" xmlns:cx6="http://schemas.microsoft.com/office/drawing/2016/5/12/chartex" xmlns:cx7="http://schemas.microsoft.com/office/drawing/2016/5/13/chartex" xmlns:cx8="http://schemas.microsoft.com/office/drawing/2016/5/14/chartex" xmlns:mc="http://schemas.openxmlformats.org/markup-compatibility/2006" xmlns:aink="http://schemas.microsoft.com/office/drawing/2016/ink" xmlns:am3d="http://schemas.microsoft.com/office/drawing/2017/model3d" xmlns:o="urn:schemas-microsoft-com:office:office" xmlns:oel="http://schemas.microsoft.com/office/2019/extlst" xmlns:r="http://schemas.openxmlformats.org/officeDocument/2006/relationships" xmlns:m="http://schemas.openxmlformats.org/officeDocument/2006/math" xmlns:v="urn:schemas-microsoft-com:vml" xmlns:wp14="http://schemas.microsoft.com/office/word/2010/wordprocessingDrawing" xmlns:wp="http://schemas.openxmlformats.org/drawingml/2006/wordprocessingDrawing" xmlns:w10="urn:schemas-microsoft-com:office:word" xmlns:w="http://schemas.openxmlformats.org/wordprocessingml/2006/main" xmlns:w14="http://schemas.microsoft.com/office/word/2010/wordml" xmlns:w15="http://schemas.microsoft.com/office/word/2012/wordml" xmlns:w16cex="http://schemas.microsoft.com/office/word/2018/wordml/cex" xmlns:w16cid="http://schemas.microsoft.com/office/word/2016/wordml/cid" xmlns:w16="http://schemas.microsoft.com/office/word/2018/wordml" xmlns:w16du="http://schemas.microsoft.com/office/word/2023/wordml/word16du" xmlns:w16sdtdh="http://schemas.microsoft.com/office/word/2020/wordml/sdtdatahash" xmlns:w16sdtfl="http://schemas.microsoft.com/office/word/2024/wordml/sdtformatlock" xmlns:w16se="http://schemas.microsoft.com/office/word/2015/wordml/symex" xmlns:wpg="http://schemas.microsoft.com/office/word/2010/wordprocessingGroup" xmlns:wpi="http://schemas.microsoft.com/office/word/2010/wordprocessingInk" xmlns:wne="http://schemas.microsoft.com/office/word/2006/wordml" xmlns:wps="http://schemas.microsoft.com/office/word/2010/wordprocessingShape" mc:Ignorable="w14 w15 w16se w16cid w16 w16cex w16sdtdh w16sdtfl w16du wp14">
+  <w:endnote w:type="separator" w:id="-1">
+    <w:p>
+      <w:pPr>
+        <w:spacing w:after="0" w:line="240" w:lineRule="auto"/>
+      </w:pPr>
+      <w:r>
+        <w:separator/>
+      </w:r>
+    </w:p>
+  </w:endnote>
+  <w:endnote w:type="continuationSeparator" w:id="0">
+    <w:p>
+      <w:pPr>
+        <w:spacing w:after="0" w:line="240" w:lineRule="auto"/>
+      </w:pPr>
+      <w:r>
+        <w:continuationSeparator/>
+      </w:r>
+    </w:p>
+  </w:endnote>
+</w:endnotes>
+</file>
+
+<file path=word/footer1.xml><?xml version="1.0" encoding="utf-8"?>
+<w:ftr xmlns:wpc="http://schemas.microsoft.com/office/word/2010/wordprocessingCanvas" xmlns:cx="http://schemas.microsoft.com/office/drawing/2014/chartex" xmlns:cx1="http://schemas.microsoft.com/office/drawing/2015/9/8/chartex" xmlns:cx2="http://schemas.microsoft.com/office/drawing/2015/10/21/chartex" xmlns:cx3="http://schemas.microsoft.com/office/drawing/2016/5/9/chartex" xmlns:cx4="http://schemas.microsoft.com/office/drawing/2016/5/10/chartex" xmlns:cx5="http://schemas.microsoft.com/office/drawing/2016/5/11/chartex" xmlns:cx6="http://schemas.microsoft.com/office/drawing/2016/5/12/chartex" xmlns:cx7="http://schemas.microsoft.com/office/drawing/2016/5/13/chartex" xmlns:cx8="http://schemas.microsoft.com/office/drawing/2016/5/14/chartex" xmlns:mc="http://schemas.openxmlformats.org/markup-compatibility/2006" xmlns:aink="http://schemas.microsoft.com/office/drawing/2016/ink" xmlns:am3d="http://schemas.microsoft.com/office/drawing/2017/model3d" xmlns:o="urn:schemas-microsoft-com:office:office" xmlns:oel="http://schemas.microsoft.com/office/2019/extlst" xmlns:r="http://schemas.openxmlformats.org/officeDocument/2006/relationships" xmlns:m="http://schemas.openxmlformats.org/officeDocument/2006/math" xmlns:v="urn:schemas-microsoft-com:vml" xmlns:wp14="http://schemas.microsoft.com/office/word/2010/wordprocessingDrawing" xmlns:wp="http://schemas.openxmlformats.org/drawingml/2006/wordprocessingDrawing" xmlns:w10="urn:schemas-microsoft-com:office:word" xmlns:w="http://schemas.openxmlformats.org/wordprocessingml/2006/main" xmlns:w14="http://schemas.microsoft.com/office/word/2010/wordml" xmlns:w15="http://schemas.microsoft.com/office/word/2012/wordml" xmlns:w16cex="http://schemas.microsoft.com/office/word/2018/wordml/cex" xmlns:w16cid="http://schemas.microsoft.com/office/word/2016/wordml/cid" xmlns:w16="http://schemas.microsoft.com/office/word/2018/wordml" xmlns:w16du="http://schemas.microsoft.com/office/word/2023/wordml/word16du" xmlns:w16sdtdh="http://schemas.microsoft.com/office/word/2020/wordml/sdtdatahash" xmlns:w16sdtfl="http://schemas.microsoft.com/office/word/2024/wordml/sdtformatlock" xmlns:w16se="http://schemas.microsoft.com/office/word/2015/wordml/symex" xmlns:wpg="http://schemas.microsoft.com/office/word/2010/wordprocessingGroup" xmlns:wpi="http://schemas.microsoft.com/office/word/2010/wordprocessingInk" xmlns:wne="http://schemas.microsoft.com/office/word/2006/wordml" xmlns:wps="http://schemas.microsoft.com/office/word/2010/wordprocessingShape" mc:Ignorable="w14 w15 w16se w16cid w16 w16cex w16sdtdh w16sdtfl w16du wp14">
+  <w:sdt>
+    <w:sdtPr>
+      <w:id w:val="536169276"/>
+      <w:docPartObj>
+        <w:docPartGallery w:val="Page Numbers (Bottom of Page)"/>
+        <w:docPartUnique/>
+      </w:docPartObj>
+    </w:sdtPr>
+    <w:sdtEndPr>
+      <w:rPr>
+        <w:noProof/>
+      </w:rPr>
+    </w:sdtEndPr>
+    <w:sdtContent>
+      <w:p>
+        <w:pPr>
+          <w:pStyle w:val="Footer"/>
+          <w:jc w:val="center"/>
+        </w:pPr>
+        <w:r>
+          <w:fldChar w:fldCharType="begin"/>
+        </w:r>
+        <w:r>
+          <w:instrText xml:space="preserve"> PAGE   \* MERGEFORMAT </w:instrText>
+        </w:r>
+        <w:r>
+          <w:fldChar w:fldCharType="separate"/>
+        </w:r>
+        <w:r>
+          <w:rPr>
+            <w:noProof/>
+          </w:rPr>
+          <w:t>2</w:t>
+        </w:r>
+        <w:r>
+          <w:rPr>
+            <w:noProof/>
+          </w:rPr>
+          <w:fldChar w:fldCharType="end"/>
+        </w:r>
+      </w:p>
+    </w:sdtContent>
+  </w:sdt>
+  <w:p>
+    <w:pPr>
+      <w:pStyle w:val="Footer"/>
+    </w:pPr>
+  </w:p>
+</w:ftr>
+</file>
+
+<file path=word/footnotes.xml><?xml version="1.0" encoding="utf-8"?>
+<w:footnotes xmlns:wpc="http://schemas.microsoft.com/office/word/2010/wordprocessingCanvas" xmlns:cx="http://schemas.microsoft.com/office/drawing/2014/chartex" xmlns:cx1="http://schemas.microsoft.com/office/drawing/2015/9/8/chartex" xmlns:cx2="http://schemas.microsoft.com/office/drawing/2015/10/21/chartex" xmlns:cx3="http://schemas.microsoft.com/office/drawing/2016/5/9/chartex" xmlns:cx4="http://schemas.microsoft.com/office/drawing/2016/5/10/chartex" xmlns:cx5="http://schemas.microsoft.com/office/drawing/2016/5/11/chartex" xmlns:cx6="http://schemas.microsoft.com/office/drawing/2016/5/12/chartex" xmlns:cx7="http://schemas.microsoft.com/office/drawing/2016/5/13/chartex" xmlns:cx8="http://schemas.microsoft.com/office/drawing/2016/5/14/chartex" xmlns:mc="http://schemas.openxmlformats.org/markup-compatibility/2006" xmlns:aink="http://schemas.microsoft.com/office/drawing/2016/ink" xmlns:am3d="http://schemas.microsoft.com/office/drawing/2017/model3d" xmlns:o="urn:schemas-microsoft-com:office:office" xmlns:oel="http://schemas.microsoft.com/office/2019/extlst" xmlns:r="http://schemas.openxmlformats.org/officeDocument/2006/relationships" xmlns:m="http://schemas.openxmlformats.org/officeDocument/2006/math" xmlns:v="urn:schemas-microsoft-com:vml" xmlns:wp14="http://schemas.microsoft.com/office/word/2010/wordprocessingDrawing" xmlns:wp="http://schemas.openxmlformats.org/drawingml/2006/wordprocessingDrawing" xmlns:w10="urn:schemas-microsoft-com:office:word" xmlns:w="http://schemas.openxmlformats.org/wordprocessingml/2006/main" xmlns:w14="http://schemas.microsoft.com/office/word/2010/wordml" xmlns:w15="http://schemas.microsoft.com/office/word/2012/wordml" xmlns:w16cex="http://schemas.microsoft.com/office/word/2018/wordml/cex" xmlns:w16cid="http://schemas.microsoft.com/office/word/2016/wordml/cid" xmlns:w16="http://schemas.microsoft.com/office/word/2018/wordml" xmlns:w16du="http://schemas.microsoft.com/office/word/2023/wordml/word16du" xmlns:w16sdtdh="http://schemas.microsoft.com/office/word/2020/wordml/sdtdatahash" xmlns:w16sdtfl="http://schemas.microsoft.com/office/word/2024/wordml/sdtformatlock" xmlns:w16se="http://schemas.microsoft.com/office/word/2015/wordml/symex" xmlns:wpg="http://schemas.microsoft.com/office/word/2010/wordprocessingGroup" xmlns:wpi="http://schemas.microsoft.com/office/word/2010/wordprocessingInk" xmlns:wne="http://schemas.microsoft.com/office/word/2006/wordml" xmlns:wps="http://schemas.microsoft.com/office/word/2010/wordprocessingShape" mc:Ignorable="w14 w15 w16se w16cid w16 w16cex w16sdtdh w16sdtfl w16du wp14">
+  <w:footnote w:type="separator" w:id="-1">
+    <w:p>
+      <w:pPr>
+        <w:spacing w:after="0" w:line="240" w:lineRule="auto"/>
+      </w:pPr>
+      <w:r>
+        <w:separator/>
+      </w:r>
+    </w:p>
+  </w:footnote>
+  <w:footnote w:type="continuationSeparator" w:id="0">
+    <w:p>
+      <w:pPr>
+        <w:spacing w:after="0" w:line="240" w:lineRule="auto"/>
+      </w:pPr>
+      <w:r>
+        <w:continuationSeparator/>
+      </w:r>
+    </w:p>
+  </w:footnote>
+</w:footnotes>
 </file>
 
 <file path=word/styles.xml><?xml version="1.0" encoding="utf-8"?>
@@ -4028,6 +4393,50 @@
       <w:spacing w:val="5"/>
     </w:rPr>
   </w:style>
+  <w:style w:type="paragraph" w:styleId="Header">
+    <w:name w:val="header"/>
+    <w:basedOn w:val="Normal"/>
+    <w:link w:val="HeaderChar"/>
+    <w:uiPriority w:val="99"/>
+    <w:unhideWhenUsed/>
+    <w:rsid w:val="00154BF6"/>
+    <w:pPr>
+      <w:tabs>
+        <w:tab w:val="center" w:pos="4680"/>
+        <w:tab w:val="right" w:pos="9360"/>
+      </w:tabs>
+      <w:spacing w:after="0" w:line="240" w:lineRule="auto"/>
+    </w:pPr>
+  </w:style>
+  <w:style w:type="character" w:customStyle="1" w:styleId="HeaderChar">
+    <w:name w:val="Header Char"/>
+    <w:basedOn w:val="DefaultParagraphFont"/>
+    <w:link w:val="Header"/>
+    <w:uiPriority w:val="99"/>
+    <w:rsid w:val="00154BF6"/>
+  </w:style>
+  <w:style w:type="paragraph" w:styleId="Footer">
+    <w:name w:val="footer"/>
+    <w:basedOn w:val="Normal"/>
+    <w:link w:val="FooterChar"/>
+    <w:uiPriority w:val="99"/>
+    <w:unhideWhenUsed/>
+    <w:rsid w:val="00154BF6"/>
+    <w:pPr>
+      <w:tabs>
+        <w:tab w:val="center" w:pos="4680"/>
+        <w:tab w:val="right" w:pos="9360"/>
+      </w:tabs>
+      <w:spacing w:after="0" w:line="240" w:lineRule="auto"/>
+    </w:pPr>
+  </w:style>
+  <w:style w:type="character" w:customStyle="1" w:styleId="FooterChar">
+    <w:name w:val="Footer Char"/>
+    <w:basedOn w:val="DefaultParagraphFont"/>
+    <w:link w:val="Footer"/>
+    <w:uiPriority w:val="99"/>
+    <w:rsid w:val="00154BF6"/>
+  </w:style>
 </w:styles>
 </file>
 

</xml_diff>